<commit_message>
testes unitarios prints word.doc
</commit_message>
<xml_diff>
--- a/Testes unitários.docx
+++ b/Testes unitários.docx
@@ -10,6 +10,9 @@
         <w:br/>
       </w:r>
       <w:r>
+        <w:rPr>
+          <w:noProof/>
+        </w:rPr>
         <w:drawing>
           <wp:inline distT="0" distB="0" distL="0" distR="0" wp14:anchorId="21A71C42" wp14:editId="69227081">
             <wp:extent cx="5400040" cy="1678305"/>
@@ -49,6 +52,9 @@
     </w:p>
     <w:p>
       <w:r>
+        <w:rPr>
+          <w:noProof/>
+        </w:rPr>
         <w:drawing>
           <wp:inline distT="0" distB="0" distL="0" distR="0" wp14:anchorId="2D209B12" wp14:editId="5CE072E4">
             <wp:extent cx="5400040" cy="1952625"/>
@@ -88,6 +94,10 @@
     </w:p>
     <w:p>
       <w:r>
+        <w:rPr>
+          <w:noProof/>
+        </w:rPr>
+        <w:lastRenderedPageBreak/>
         <w:drawing>
           <wp:inline distT="0" distB="0" distL="0" distR="0" wp14:anchorId="0E9169C1" wp14:editId="68529766">
             <wp:extent cx="5400040" cy="4217035"/>
@@ -113,6 +123,348 @@
                     <a:xfrm>
                       <a:off x="0" y="0"/>
                       <a:ext cx="5400040" cy="4217035"/>
+                    </a:xfrm>
+                    <a:prstGeom prst="rect">
+                      <a:avLst/>
+                    </a:prstGeom>
+                  </pic:spPr>
+                </pic:pic>
+              </a:graphicData>
+            </a:graphic>
+          </wp:inline>
+        </w:drawing>
+      </w:r>
+      <w:r>
+        <w:br/>
+      </w:r>
+      <w:r>
+        <w:br/>
+      </w:r>
+      <w:r>
+        <w:rPr>
+          <w:noProof/>
+        </w:rPr>
+        <w:drawing>
+          <wp:inline distT="0" distB="0" distL="0" distR="0" wp14:anchorId="42863FEA" wp14:editId="2A7E74F1">
+            <wp:extent cx="5400040" cy="2503170"/>
+            <wp:effectExtent l="0" t="0" r="0" b="0"/>
+            <wp:docPr id="98301608" name="Imagem 1"/>
+            <wp:cNvGraphicFramePr>
+              <a:graphicFrameLocks xmlns:a="http://schemas.openxmlformats.org/drawingml/2006/main" noChangeAspect="1"/>
+            </wp:cNvGraphicFramePr>
+            <a:graphic xmlns:a="http://schemas.openxmlformats.org/drawingml/2006/main">
+              <a:graphicData uri="http://schemas.openxmlformats.org/drawingml/2006/picture">
+                <pic:pic xmlns:pic="http://schemas.openxmlformats.org/drawingml/2006/picture">
+                  <pic:nvPicPr>
+                    <pic:cNvPr id="98301608" name=""/>
+                    <pic:cNvPicPr/>
+                  </pic:nvPicPr>
+                  <pic:blipFill>
+                    <a:blip r:embed="rId7"/>
+                    <a:stretch>
+                      <a:fillRect/>
+                    </a:stretch>
+                  </pic:blipFill>
+                  <pic:spPr>
+                    <a:xfrm>
+                      <a:off x="0" y="0"/>
+                      <a:ext cx="5400040" cy="2503170"/>
+                    </a:xfrm>
+                    <a:prstGeom prst="rect">
+                      <a:avLst/>
+                    </a:prstGeom>
+                  </pic:spPr>
+                </pic:pic>
+              </a:graphicData>
+            </a:graphic>
+          </wp:inline>
+        </w:drawing>
+      </w:r>
+    </w:p>
+    <w:p>
+      <w:r>
+        <w:rPr>
+          <w:noProof/>
+        </w:rPr>
+        <w:lastRenderedPageBreak/>
+        <w:drawing>
+          <wp:inline distT="0" distB="0" distL="0" distR="0" wp14:anchorId="0099941E" wp14:editId="602798F9">
+            <wp:extent cx="5400040" cy="4170680"/>
+            <wp:effectExtent l="0" t="0" r="0" b="1270"/>
+            <wp:docPr id="216770069" name="Imagem 1"/>
+            <wp:cNvGraphicFramePr>
+              <a:graphicFrameLocks xmlns:a="http://schemas.openxmlformats.org/drawingml/2006/main" noChangeAspect="1"/>
+            </wp:cNvGraphicFramePr>
+            <a:graphic xmlns:a="http://schemas.openxmlformats.org/drawingml/2006/main">
+              <a:graphicData uri="http://schemas.openxmlformats.org/drawingml/2006/picture">
+                <pic:pic xmlns:pic="http://schemas.openxmlformats.org/drawingml/2006/picture">
+                  <pic:nvPicPr>
+                    <pic:cNvPr id="216770069" name=""/>
+                    <pic:cNvPicPr/>
+                  </pic:nvPicPr>
+                  <pic:blipFill>
+                    <a:blip r:embed="rId8"/>
+                    <a:stretch>
+                      <a:fillRect/>
+                    </a:stretch>
+                  </pic:blipFill>
+                  <pic:spPr>
+                    <a:xfrm>
+                      <a:off x="0" y="0"/>
+                      <a:ext cx="5400040" cy="4170680"/>
+                    </a:xfrm>
+                    <a:prstGeom prst="rect">
+                      <a:avLst/>
+                    </a:prstGeom>
+                  </pic:spPr>
+                </pic:pic>
+              </a:graphicData>
+            </a:graphic>
+          </wp:inline>
+        </w:drawing>
+      </w:r>
+    </w:p>
+    <w:p>
+      <w:r>
+        <w:rPr>
+          <w:noProof/>
+        </w:rPr>
+        <w:drawing>
+          <wp:inline distT="0" distB="0" distL="0" distR="0" wp14:anchorId="2EA5EE4A" wp14:editId="67AEC69D">
+            <wp:extent cx="5400040" cy="4264025"/>
+            <wp:effectExtent l="0" t="0" r="0" b="3175"/>
+            <wp:docPr id="1517765156" name="Imagem 1"/>
+            <wp:cNvGraphicFramePr>
+              <a:graphicFrameLocks xmlns:a="http://schemas.openxmlformats.org/drawingml/2006/main" noChangeAspect="1"/>
+            </wp:cNvGraphicFramePr>
+            <a:graphic xmlns:a="http://schemas.openxmlformats.org/drawingml/2006/main">
+              <a:graphicData uri="http://schemas.openxmlformats.org/drawingml/2006/picture">
+                <pic:pic xmlns:pic="http://schemas.openxmlformats.org/drawingml/2006/picture">
+                  <pic:nvPicPr>
+                    <pic:cNvPr id="1517765156" name=""/>
+                    <pic:cNvPicPr/>
+                  </pic:nvPicPr>
+                  <pic:blipFill>
+                    <a:blip r:embed="rId9"/>
+                    <a:stretch>
+                      <a:fillRect/>
+                    </a:stretch>
+                  </pic:blipFill>
+                  <pic:spPr>
+                    <a:xfrm>
+                      <a:off x="0" y="0"/>
+                      <a:ext cx="5400040" cy="4264025"/>
+                    </a:xfrm>
+                    <a:prstGeom prst="rect">
+                      <a:avLst/>
+                    </a:prstGeom>
+                  </pic:spPr>
+                </pic:pic>
+              </a:graphicData>
+            </a:graphic>
+          </wp:inline>
+        </w:drawing>
+      </w:r>
+    </w:p>
+    <w:p>
+      <w:r>
+        <w:rPr>
+          <w:noProof/>
+        </w:rPr>
+        <w:lastRenderedPageBreak/>
+        <w:drawing>
+          <wp:inline distT="0" distB="0" distL="0" distR="0" wp14:anchorId="6D11F694" wp14:editId="652D6A2C">
+            <wp:extent cx="3838575" cy="619125"/>
+            <wp:effectExtent l="0" t="0" r="9525" b="9525"/>
+            <wp:docPr id="162296814" name="Imagem 1"/>
+            <wp:cNvGraphicFramePr>
+              <a:graphicFrameLocks xmlns:a="http://schemas.openxmlformats.org/drawingml/2006/main" noChangeAspect="1"/>
+            </wp:cNvGraphicFramePr>
+            <a:graphic xmlns:a="http://schemas.openxmlformats.org/drawingml/2006/main">
+              <a:graphicData uri="http://schemas.openxmlformats.org/drawingml/2006/picture">
+                <pic:pic xmlns:pic="http://schemas.openxmlformats.org/drawingml/2006/picture">
+                  <pic:nvPicPr>
+                    <pic:cNvPr id="162296814" name=""/>
+                    <pic:cNvPicPr/>
+                  </pic:nvPicPr>
+                  <pic:blipFill>
+                    <a:blip r:embed="rId10"/>
+                    <a:stretch>
+                      <a:fillRect/>
+                    </a:stretch>
+                  </pic:blipFill>
+                  <pic:spPr>
+                    <a:xfrm>
+                      <a:off x="0" y="0"/>
+                      <a:ext cx="3838575" cy="619125"/>
+                    </a:xfrm>
+                    <a:prstGeom prst="rect">
+                      <a:avLst/>
+                    </a:prstGeom>
+                  </pic:spPr>
+                </pic:pic>
+              </a:graphicData>
+            </a:graphic>
+          </wp:inline>
+        </w:drawing>
+      </w:r>
+    </w:p>
+    <w:p>
+      <w:r>
+        <w:rPr>
+          <w:noProof/>
+        </w:rPr>
+        <w:drawing>
+          <wp:inline distT="0" distB="0" distL="0" distR="0" wp14:anchorId="2F9AD495" wp14:editId="61DA1C3D">
+            <wp:extent cx="3971925" cy="600075"/>
+            <wp:effectExtent l="0" t="0" r="9525" b="9525"/>
+            <wp:docPr id="1657177900" name="Imagem 1"/>
+            <wp:cNvGraphicFramePr>
+              <a:graphicFrameLocks xmlns:a="http://schemas.openxmlformats.org/drawingml/2006/main" noChangeAspect="1"/>
+            </wp:cNvGraphicFramePr>
+            <a:graphic xmlns:a="http://schemas.openxmlformats.org/drawingml/2006/main">
+              <a:graphicData uri="http://schemas.openxmlformats.org/drawingml/2006/picture">
+                <pic:pic xmlns:pic="http://schemas.openxmlformats.org/drawingml/2006/picture">
+                  <pic:nvPicPr>
+                    <pic:cNvPr id="1657177900" name=""/>
+                    <pic:cNvPicPr/>
+                  </pic:nvPicPr>
+                  <pic:blipFill>
+                    <a:blip r:embed="rId11"/>
+                    <a:stretch>
+                      <a:fillRect/>
+                    </a:stretch>
+                  </pic:blipFill>
+                  <pic:spPr>
+                    <a:xfrm>
+                      <a:off x="0" y="0"/>
+                      <a:ext cx="3971925" cy="600075"/>
+                    </a:xfrm>
+                    <a:prstGeom prst="rect">
+                      <a:avLst/>
+                    </a:prstGeom>
+                  </pic:spPr>
+                </pic:pic>
+              </a:graphicData>
+            </a:graphic>
+          </wp:inline>
+        </w:drawing>
+      </w:r>
+    </w:p>
+    <w:p>
+      <w:r>
+        <w:rPr>
+          <w:noProof/>
+        </w:rPr>
+        <w:drawing>
+          <wp:inline distT="0" distB="0" distL="0" distR="0" wp14:anchorId="321BD282" wp14:editId="70679F36">
+            <wp:extent cx="4391025" cy="1362075"/>
+            <wp:effectExtent l="0" t="0" r="9525" b="9525"/>
+            <wp:docPr id="1602305671" name="Imagem 1"/>
+            <wp:cNvGraphicFramePr>
+              <a:graphicFrameLocks xmlns:a="http://schemas.openxmlformats.org/drawingml/2006/main" noChangeAspect="1"/>
+            </wp:cNvGraphicFramePr>
+            <a:graphic xmlns:a="http://schemas.openxmlformats.org/drawingml/2006/main">
+              <a:graphicData uri="http://schemas.openxmlformats.org/drawingml/2006/picture">
+                <pic:pic xmlns:pic="http://schemas.openxmlformats.org/drawingml/2006/picture">
+                  <pic:nvPicPr>
+                    <pic:cNvPr id="1602305671" name=""/>
+                    <pic:cNvPicPr/>
+                  </pic:nvPicPr>
+                  <pic:blipFill>
+                    <a:blip r:embed="rId12"/>
+                    <a:stretch>
+                      <a:fillRect/>
+                    </a:stretch>
+                  </pic:blipFill>
+                  <pic:spPr>
+                    <a:xfrm>
+                      <a:off x="0" y="0"/>
+                      <a:ext cx="4391025" cy="1362075"/>
+                    </a:xfrm>
+                    <a:prstGeom prst="rect">
+                      <a:avLst/>
+                    </a:prstGeom>
+                  </pic:spPr>
+                </pic:pic>
+              </a:graphicData>
+            </a:graphic>
+          </wp:inline>
+        </w:drawing>
+      </w:r>
+    </w:p>
+    <w:p>
+      <w:r>
+        <w:rPr>
+          <w:noProof/>
+        </w:rPr>
+        <w:drawing>
+          <wp:inline distT="0" distB="0" distL="0" distR="0" wp14:anchorId="379DE711" wp14:editId="3FB65716">
+            <wp:extent cx="4505325" cy="1524000"/>
+            <wp:effectExtent l="0" t="0" r="9525" b="0"/>
+            <wp:docPr id="2022501944" name="Imagem 1"/>
+            <wp:cNvGraphicFramePr>
+              <a:graphicFrameLocks xmlns:a="http://schemas.openxmlformats.org/drawingml/2006/main" noChangeAspect="1"/>
+            </wp:cNvGraphicFramePr>
+            <a:graphic xmlns:a="http://schemas.openxmlformats.org/drawingml/2006/main">
+              <a:graphicData uri="http://schemas.openxmlformats.org/drawingml/2006/picture">
+                <pic:pic xmlns:pic="http://schemas.openxmlformats.org/drawingml/2006/picture">
+                  <pic:nvPicPr>
+                    <pic:cNvPr id="2022501944" name=""/>
+                    <pic:cNvPicPr/>
+                  </pic:nvPicPr>
+                  <pic:blipFill>
+                    <a:blip r:embed="rId13"/>
+                    <a:stretch>
+                      <a:fillRect/>
+                    </a:stretch>
+                  </pic:blipFill>
+                  <pic:spPr>
+                    <a:xfrm>
+                      <a:off x="0" y="0"/>
+                      <a:ext cx="4505325" cy="1524000"/>
+                    </a:xfrm>
+                    <a:prstGeom prst="rect">
+                      <a:avLst/>
+                    </a:prstGeom>
+                  </pic:spPr>
+                </pic:pic>
+              </a:graphicData>
+            </a:graphic>
+          </wp:inline>
+        </w:drawing>
+      </w:r>
+    </w:p>
+    <w:p>
+      <w:r>
+        <w:rPr>
+          <w:noProof/>
+        </w:rPr>
+        <w:drawing>
+          <wp:inline distT="0" distB="0" distL="0" distR="0" wp14:anchorId="4A6BBA39" wp14:editId="3BB5DC80">
+            <wp:extent cx="5400040" cy="2575560"/>
+            <wp:effectExtent l="0" t="0" r="0" b="0"/>
+            <wp:docPr id="916938564" name="Imagem 1"/>
+            <wp:cNvGraphicFramePr>
+              <a:graphicFrameLocks xmlns:a="http://schemas.openxmlformats.org/drawingml/2006/main" noChangeAspect="1"/>
+            </wp:cNvGraphicFramePr>
+            <a:graphic xmlns:a="http://schemas.openxmlformats.org/drawingml/2006/main">
+              <a:graphicData uri="http://schemas.openxmlformats.org/drawingml/2006/picture">
+                <pic:pic xmlns:pic="http://schemas.openxmlformats.org/drawingml/2006/picture">
+                  <pic:nvPicPr>
+                    <pic:cNvPr id="916938564" name=""/>
+                    <pic:cNvPicPr/>
+                  </pic:nvPicPr>
+                  <pic:blipFill>
+                    <a:blip r:embed="rId14"/>
+                    <a:stretch>
+                      <a:fillRect/>
+                    </a:stretch>
+                  </pic:blipFill>
+                  <pic:spPr>
+                    <a:xfrm>
+                      <a:off x="0" y="0"/>
+                      <a:ext cx="5400040" cy="2575560"/>
                     </a:xfrm>
                     <a:prstGeom prst="rect">
                       <a:avLst/>
@@ -540,7 +892,7 @@
     <w:name w:val="heading 1"/>
     <w:basedOn w:val="Normal"/>
     <w:next w:val="Normal"/>
-    <w:link w:val="Ttulo1Char"/>
+    <w:link w:val="Ttulo1Carter"/>
     <w:uiPriority w:val="9"/>
     <w:qFormat/>
     <w:rsid w:val="00BF3C8F"/>
@@ -561,7 +913,7 @@
     <w:name w:val="heading 2"/>
     <w:basedOn w:val="Normal"/>
     <w:next w:val="Normal"/>
-    <w:link w:val="Ttulo2Char"/>
+    <w:link w:val="Ttulo2Carter"/>
     <w:uiPriority w:val="9"/>
     <w:semiHidden/>
     <w:unhideWhenUsed/>
@@ -584,7 +936,7 @@
     <w:name w:val="heading 3"/>
     <w:basedOn w:val="Normal"/>
     <w:next w:val="Normal"/>
-    <w:link w:val="Ttulo3Char"/>
+    <w:link w:val="Ttulo3Carter"/>
     <w:uiPriority w:val="9"/>
     <w:semiHidden/>
     <w:unhideWhenUsed/>
@@ -607,7 +959,7 @@
     <w:name w:val="heading 4"/>
     <w:basedOn w:val="Normal"/>
     <w:next w:val="Normal"/>
-    <w:link w:val="Ttulo4Char"/>
+    <w:link w:val="Ttulo4Carter"/>
     <w:uiPriority w:val="9"/>
     <w:semiHidden/>
     <w:unhideWhenUsed/>
@@ -630,7 +982,7 @@
     <w:name w:val="heading 5"/>
     <w:basedOn w:val="Normal"/>
     <w:next w:val="Normal"/>
-    <w:link w:val="Ttulo5Char"/>
+    <w:link w:val="Ttulo5Carter"/>
     <w:uiPriority w:val="9"/>
     <w:semiHidden/>
     <w:unhideWhenUsed/>
@@ -651,7 +1003,7 @@
     <w:name w:val="heading 6"/>
     <w:basedOn w:val="Normal"/>
     <w:next w:val="Normal"/>
-    <w:link w:val="Ttulo6Char"/>
+    <w:link w:val="Ttulo6Carter"/>
     <w:uiPriority w:val="9"/>
     <w:semiHidden/>
     <w:unhideWhenUsed/>
@@ -674,7 +1026,7 @@
     <w:name w:val="heading 7"/>
     <w:basedOn w:val="Normal"/>
     <w:next w:val="Normal"/>
-    <w:link w:val="Ttulo7Char"/>
+    <w:link w:val="Ttulo7Carter"/>
     <w:uiPriority w:val="9"/>
     <w:semiHidden/>
     <w:unhideWhenUsed/>
@@ -695,7 +1047,7 @@
     <w:name w:val="heading 8"/>
     <w:basedOn w:val="Normal"/>
     <w:next w:val="Normal"/>
-    <w:link w:val="Ttulo8Char"/>
+    <w:link w:val="Ttulo8Carter"/>
     <w:uiPriority w:val="9"/>
     <w:semiHidden/>
     <w:unhideWhenUsed/>
@@ -718,7 +1070,7 @@
     <w:name w:val="heading 9"/>
     <w:basedOn w:val="Normal"/>
     <w:next w:val="Normal"/>
-    <w:link w:val="Ttulo9Char"/>
+    <w:link w:val="Ttulo9Carter"/>
     <w:uiPriority w:val="9"/>
     <w:semiHidden/>
     <w:unhideWhenUsed/>
@@ -735,7 +1087,7 @@
       <w:color w:val="272727" w:themeColor="text1" w:themeTint="D8"/>
     </w:rPr>
   </w:style>
-  <w:style w:type="character" w:default="1" w:styleId="Fontepargpadro">
+  <w:style w:type="character" w:default="1" w:styleId="Tipodeletrapredefinidodopargrafo">
     <w:name w:val="Default Paragraph Font"/>
     <w:uiPriority w:val="1"/>
     <w:semiHidden/>
@@ -762,9 +1114,9 @@
     <w:semiHidden/>
     <w:unhideWhenUsed/>
   </w:style>
-  <w:style w:type="character" w:customStyle="1" w:styleId="Ttulo1Char">
-    <w:name w:val="Título 1 Char"/>
-    <w:basedOn w:val="Fontepargpadro"/>
+  <w:style w:type="character" w:customStyle="1" w:styleId="Ttulo1Carter">
+    <w:name w:val="Título 1 Caráter"/>
+    <w:basedOn w:val="Tipodeletrapredefinidodopargrafo"/>
     <w:link w:val="Ttulo1"/>
     <w:uiPriority w:val="9"/>
     <w:rsid w:val="00BF3C8F"/>
@@ -775,9 +1127,9 @@
       <w:szCs w:val="40"/>
     </w:rPr>
   </w:style>
-  <w:style w:type="character" w:customStyle="1" w:styleId="Ttulo2Char">
-    <w:name w:val="Título 2 Char"/>
-    <w:basedOn w:val="Fontepargpadro"/>
+  <w:style w:type="character" w:customStyle="1" w:styleId="Ttulo2Carter">
+    <w:name w:val="Título 2 Caráter"/>
+    <w:basedOn w:val="Tipodeletrapredefinidodopargrafo"/>
     <w:link w:val="Ttulo2"/>
     <w:uiPriority w:val="9"/>
     <w:semiHidden/>
@@ -789,9 +1141,9 @@
       <w:szCs w:val="32"/>
     </w:rPr>
   </w:style>
-  <w:style w:type="character" w:customStyle="1" w:styleId="Ttulo3Char">
-    <w:name w:val="Título 3 Char"/>
-    <w:basedOn w:val="Fontepargpadro"/>
+  <w:style w:type="character" w:customStyle="1" w:styleId="Ttulo3Carter">
+    <w:name w:val="Título 3 Caráter"/>
+    <w:basedOn w:val="Tipodeletrapredefinidodopargrafo"/>
     <w:link w:val="Ttulo3"/>
     <w:uiPriority w:val="9"/>
     <w:semiHidden/>
@@ -803,9 +1155,9 @@
       <w:szCs w:val="28"/>
     </w:rPr>
   </w:style>
-  <w:style w:type="character" w:customStyle="1" w:styleId="Ttulo4Char">
-    <w:name w:val="Título 4 Char"/>
-    <w:basedOn w:val="Fontepargpadro"/>
+  <w:style w:type="character" w:customStyle="1" w:styleId="Ttulo4Carter">
+    <w:name w:val="Título 4 Caráter"/>
+    <w:basedOn w:val="Tipodeletrapredefinidodopargrafo"/>
     <w:link w:val="Ttulo4"/>
     <w:uiPriority w:val="9"/>
     <w:semiHidden/>
@@ -817,9 +1169,9 @@
       <w:color w:val="2F5496" w:themeColor="accent1" w:themeShade="BF"/>
     </w:rPr>
   </w:style>
-  <w:style w:type="character" w:customStyle="1" w:styleId="Ttulo5Char">
-    <w:name w:val="Título 5 Char"/>
-    <w:basedOn w:val="Fontepargpadro"/>
+  <w:style w:type="character" w:customStyle="1" w:styleId="Ttulo5Carter">
+    <w:name w:val="Título 5 Caráter"/>
+    <w:basedOn w:val="Tipodeletrapredefinidodopargrafo"/>
     <w:link w:val="Ttulo5"/>
     <w:uiPriority w:val="9"/>
     <w:semiHidden/>
@@ -829,9 +1181,9 @@
       <w:color w:val="2F5496" w:themeColor="accent1" w:themeShade="BF"/>
     </w:rPr>
   </w:style>
-  <w:style w:type="character" w:customStyle="1" w:styleId="Ttulo6Char">
-    <w:name w:val="Título 6 Char"/>
-    <w:basedOn w:val="Fontepargpadro"/>
+  <w:style w:type="character" w:customStyle="1" w:styleId="Ttulo6Carter">
+    <w:name w:val="Título 6 Caráter"/>
+    <w:basedOn w:val="Tipodeletrapredefinidodopargrafo"/>
     <w:link w:val="Ttulo6"/>
     <w:uiPriority w:val="9"/>
     <w:semiHidden/>
@@ -843,9 +1195,9 @@
       <w:color w:val="595959" w:themeColor="text1" w:themeTint="A6"/>
     </w:rPr>
   </w:style>
-  <w:style w:type="character" w:customStyle="1" w:styleId="Ttulo7Char">
-    <w:name w:val="Título 7 Char"/>
-    <w:basedOn w:val="Fontepargpadro"/>
+  <w:style w:type="character" w:customStyle="1" w:styleId="Ttulo7Carter">
+    <w:name w:val="Título 7 Caráter"/>
+    <w:basedOn w:val="Tipodeletrapredefinidodopargrafo"/>
     <w:link w:val="Ttulo7"/>
     <w:uiPriority w:val="9"/>
     <w:semiHidden/>
@@ -855,9 +1207,9 @@
       <w:color w:val="595959" w:themeColor="text1" w:themeTint="A6"/>
     </w:rPr>
   </w:style>
-  <w:style w:type="character" w:customStyle="1" w:styleId="Ttulo8Char">
-    <w:name w:val="Título 8 Char"/>
-    <w:basedOn w:val="Fontepargpadro"/>
+  <w:style w:type="character" w:customStyle="1" w:styleId="Ttulo8Carter">
+    <w:name w:val="Título 8 Caráter"/>
+    <w:basedOn w:val="Tipodeletrapredefinidodopargrafo"/>
     <w:link w:val="Ttulo8"/>
     <w:uiPriority w:val="9"/>
     <w:semiHidden/>
@@ -869,9 +1221,9 @@
       <w:color w:val="272727" w:themeColor="text1" w:themeTint="D8"/>
     </w:rPr>
   </w:style>
-  <w:style w:type="character" w:customStyle="1" w:styleId="Ttulo9Char">
-    <w:name w:val="Título 9 Char"/>
-    <w:basedOn w:val="Fontepargpadro"/>
+  <w:style w:type="character" w:customStyle="1" w:styleId="Ttulo9Carter">
+    <w:name w:val="Título 9 Caráter"/>
+    <w:basedOn w:val="Tipodeletrapredefinidodopargrafo"/>
     <w:link w:val="Ttulo9"/>
     <w:uiPriority w:val="9"/>
     <w:semiHidden/>
@@ -885,7 +1237,7 @@
     <w:name w:val="Title"/>
     <w:basedOn w:val="Normal"/>
     <w:next w:val="Normal"/>
-    <w:link w:val="TtuloChar"/>
+    <w:link w:val="TtuloCarter"/>
     <w:uiPriority w:val="10"/>
     <w:qFormat/>
     <w:rsid w:val="00BF3C8F"/>
@@ -901,9 +1253,9 @@
       <w:szCs w:val="56"/>
     </w:rPr>
   </w:style>
-  <w:style w:type="character" w:customStyle="1" w:styleId="TtuloChar">
-    <w:name w:val="Título Char"/>
-    <w:basedOn w:val="Fontepargpadro"/>
+  <w:style w:type="character" w:customStyle="1" w:styleId="TtuloCarter">
+    <w:name w:val="Título Caráter"/>
+    <w:basedOn w:val="Tipodeletrapredefinidodopargrafo"/>
     <w:link w:val="Ttulo"/>
     <w:uiPriority w:val="10"/>
     <w:rsid w:val="00BF3C8F"/>
@@ -919,7 +1271,7 @@
     <w:name w:val="Subtitle"/>
     <w:basedOn w:val="Normal"/>
     <w:next w:val="Normal"/>
-    <w:link w:val="SubttuloChar"/>
+    <w:link w:val="SubttuloCarter"/>
     <w:uiPriority w:val="11"/>
     <w:qFormat/>
     <w:rsid w:val="00BF3C8F"/>
@@ -936,9 +1288,9 @@
       <w:szCs w:val="28"/>
     </w:rPr>
   </w:style>
-  <w:style w:type="character" w:customStyle="1" w:styleId="SubttuloChar">
-    <w:name w:val="Subtítulo Char"/>
-    <w:basedOn w:val="Fontepargpadro"/>
+  <w:style w:type="character" w:customStyle="1" w:styleId="SubttuloCarter">
+    <w:name w:val="Subtítulo Caráter"/>
+    <w:basedOn w:val="Tipodeletrapredefinidodopargrafo"/>
     <w:link w:val="Subttulo"/>
     <w:uiPriority w:val="11"/>
     <w:rsid w:val="00BF3C8F"/>
@@ -954,7 +1306,7 @@
     <w:name w:val="Quote"/>
     <w:basedOn w:val="Normal"/>
     <w:next w:val="Normal"/>
-    <w:link w:val="CitaoChar"/>
+    <w:link w:val="CitaoCarter"/>
     <w:uiPriority w:val="29"/>
     <w:qFormat/>
     <w:rsid w:val="00BF3C8F"/>
@@ -968,9 +1320,9 @@
       <w:color w:val="404040" w:themeColor="text1" w:themeTint="BF"/>
     </w:rPr>
   </w:style>
-  <w:style w:type="character" w:customStyle="1" w:styleId="CitaoChar">
-    <w:name w:val="Citação Char"/>
-    <w:basedOn w:val="Fontepargpadro"/>
+  <w:style w:type="character" w:customStyle="1" w:styleId="CitaoCarter">
+    <w:name w:val="Citação Caráter"/>
+    <w:basedOn w:val="Tipodeletrapredefinidodopargrafo"/>
     <w:link w:val="Citao"/>
     <w:uiPriority w:val="29"/>
     <w:rsid w:val="00BF3C8F"/>
@@ -993,7 +1345,7 @@
   </w:style>
   <w:style w:type="character" w:styleId="nfaseIntensa">
     <w:name w:val="Intense Emphasis"/>
-    <w:basedOn w:val="Fontepargpadro"/>
+    <w:basedOn w:val="Tipodeletrapredefinidodopargrafo"/>
     <w:uiPriority w:val="21"/>
     <w:qFormat/>
     <w:rsid w:val="00BF3C8F"/>
@@ -1007,7 +1359,7 @@
     <w:name w:val="Intense Quote"/>
     <w:basedOn w:val="Normal"/>
     <w:next w:val="Normal"/>
-    <w:link w:val="CitaoIntensaChar"/>
+    <w:link w:val="CitaoIntensaCarter"/>
     <w:uiPriority w:val="30"/>
     <w:qFormat/>
     <w:rsid w:val="00BF3C8F"/>
@@ -1026,9 +1378,9 @@
       <w:color w:val="2F5496" w:themeColor="accent1" w:themeShade="BF"/>
     </w:rPr>
   </w:style>
-  <w:style w:type="character" w:customStyle="1" w:styleId="CitaoIntensaChar">
-    <w:name w:val="Citação Intensa Char"/>
-    <w:basedOn w:val="Fontepargpadro"/>
+  <w:style w:type="character" w:customStyle="1" w:styleId="CitaoIntensaCarter">
+    <w:name w:val="Citação Intensa Caráter"/>
+    <w:basedOn w:val="Tipodeletrapredefinidodopargrafo"/>
     <w:link w:val="CitaoIntensa"/>
     <w:uiPriority w:val="30"/>
     <w:rsid w:val="00BF3C8F"/>
@@ -1040,7 +1392,7 @@
   </w:style>
   <w:style w:type="character" w:styleId="RefernciaIntensa">
     <w:name w:val="Intense Reference"/>
-    <w:basedOn w:val="Fontepargpadro"/>
+    <w:basedOn w:val="Tipodeletrapredefinidodopargrafo"/>
     <w:uiPriority w:val="32"/>
     <w:qFormat/>
     <w:rsid w:val="00BF3C8F"/>

</xml_diff>

<commit_message>
implementacao de novas funcionalidades e interface grafica final
</commit_message>
<xml_diff>
--- a/Testes unitários.docx
+++ b/Testes unitários.docx
@@ -4,7 +4,351 @@
   <w:body>
     <w:p>
       <w:r>
-        <w:t>Testes unitários:</w:t>
+        <w:rPr>
+          <w:b/>
+          <w:bCs/>
+        </w:rPr>
+        <w:t>Alteração e novas classes criadas:</w:t>
+      </w:r>
+      <w:r>
+        <w:br/>
+        <w:t xml:space="preserve">Alteraçãoes na </w:t>
+      </w:r>
+      <w:r>
+        <w:rPr>
+          <w:color w:val="EE0000"/>
+        </w:rPr>
+        <w:t xml:space="preserve">classe main: </w:t>
+      </w:r>
+      <w:r>
+        <w:t xml:space="preserve">retirada do scanner para entrada de produtos e valores para gerar calculos. </w:t>
+      </w:r>
+      <w:r>
+        <w:br/>
+        <w:t>classe main so executa a janela principal GUI</w:t>
+      </w:r>
+      <w:r>
+        <w:br/>
+      </w:r>
+      <w:r>
+        <w:br/>
+        <w:t xml:space="preserve">implementações na </w:t>
+      </w:r>
+      <w:r>
+        <w:rPr>
+          <w:color w:val="EE0000"/>
+        </w:rPr>
+        <w:t>classe produto:</w:t>
+      </w:r>
+      <w:r>
+        <w:br/>
+        <w:t>implementação de get e set para preencher json local para salvar e remover produtos com valores no catalogo.</w:t>
+      </w:r>
+      <w:r>
+        <w:br/>
+      </w:r>
+      <w:r>
+        <w:br/>
+      </w:r>
+      <w:r>
+        <w:rPr>
+          <w:color w:val="EE0000"/>
+        </w:rPr>
+        <w:t>Novas classes:</w:t>
+      </w:r>
+      <w:r>
+        <w:br/>
+        <w:t>FormaPagamento = interface que aplica metodo de pagamento</w:t>
+      </w:r>
+      <w:r>
+        <w:br/>
+      </w:r>
+      <w:r>
+        <w:br/>
+        <w:t xml:space="preserve">PagamentoCredito = classe que contem o calculo simples de juros por quantidade </w:t>
+      </w:r>
+      <w:r>
+        <w:br/>
+        <w:t>de parcela, juros foi definido manualmente no codigo.</w:t>
+      </w:r>
+      <w:r>
+        <w:br/>
+      </w:r>
+      <w:r>
+        <w:br/>
+        <w:t>PagamentoPadrao =  classe que implementa o metodo de pagamento para seleção de pix, debito e dinheiro, que não havera nenhuma alteração no desconto final.</w:t>
+      </w:r>
+      <w:r>
+        <w:br/>
+      </w:r>
+      <w:r>
+        <w:br/>
+        <w:t>PagamentoFactory = classe que cria o pagamento e chama os metodos credito e padrao.</w:t>
+      </w:r>
+      <w:r>
+        <w:br/>
+      </w:r>
+      <w:r>
+        <w:br/>
+        <w:t>GerenciadorProdutos = classe que se comunica com o json para salvar produtos no catalogo e remover, nome e preço.</w:t>
+      </w:r>
+      <w:r>
+        <w:br/>
+      </w:r>
+      <w:r>
+        <w:br/>
+        <w:t xml:space="preserve">JanelaPrincipal = classe principal do motor de interface grafica, também exibe no console os logs das alterações e calculos feitos. </w:t>
+      </w:r>
+    </w:p>
+    <w:p>
+      <w:r>
+        <w:rPr>
+          <w:noProof/>
+        </w:rPr>
+        <w:drawing>
+          <wp:inline distT="0" distB="0" distL="0" distR="0" wp14:anchorId="2DEDB034" wp14:editId="128D8AD8">
+            <wp:extent cx="2339340" cy="453546"/>
+            <wp:effectExtent l="0" t="0" r="3810" b="3810"/>
+            <wp:docPr id="491300621" name="Imagem 1"/>
+            <wp:cNvGraphicFramePr>
+              <a:graphicFrameLocks xmlns:a="http://schemas.openxmlformats.org/drawingml/2006/main" noChangeAspect="1"/>
+            </wp:cNvGraphicFramePr>
+            <a:graphic xmlns:a="http://schemas.openxmlformats.org/drawingml/2006/main">
+              <a:graphicData uri="http://schemas.openxmlformats.org/drawingml/2006/picture">
+                <pic:pic xmlns:pic="http://schemas.openxmlformats.org/drawingml/2006/picture">
+                  <pic:nvPicPr>
+                    <pic:cNvPr id="491300621" name=""/>
+                    <pic:cNvPicPr/>
+                  </pic:nvPicPr>
+                  <pic:blipFill>
+                    <a:blip r:embed="rId4"/>
+                    <a:stretch>
+                      <a:fillRect/>
+                    </a:stretch>
+                  </pic:blipFill>
+                  <pic:spPr>
+                    <a:xfrm>
+                      <a:off x="0" y="0"/>
+                      <a:ext cx="2352765" cy="456149"/>
+                    </a:xfrm>
+                    <a:prstGeom prst="rect">
+                      <a:avLst/>
+                    </a:prstGeom>
+                  </pic:spPr>
+                </pic:pic>
+              </a:graphicData>
+            </a:graphic>
+          </wp:inline>
+        </w:drawing>
+      </w:r>
+      <w:r>
+        <w:br/>
+      </w:r>
+      <w:r>
+        <w:br/>
+      </w:r>
+      <w:r>
+        <w:rPr>
+          <w:noProof/>
+        </w:rPr>
+        <w:drawing>
+          <wp:inline distT="0" distB="0" distL="0" distR="0" wp14:anchorId="5B142CAD" wp14:editId="3002C922">
+            <wp:extent cx="3787140" cy="2202188"/>
+            <wp:effectExtent l="0" t="0" r="3810" b="7620"/>
+            <wp:docPr id="1774233680" name="Imagem 1"/>
+            <wp:cNvGraphicFramePr>
+              <a:graphicFrameLocks xmlns:a="http://schemas.openxmlformats.org/drawingml/2006/main" noChangeAspect="1"/>
+            </wp:cNvGraphicFramePr>
+            <a:graphic xmlns:a="http://schemas.openxmlformats.org/drawingml/2006/main">
+              <a:graphicData uri="http://schemas.openxmlformats.org/drawingml/2006/picture">
+                <pic:pic xmlns:pic="http://schemas.openxmlformats.org/drawingml/2006/picture">
+                  <pic:nvPicPr>
+                    <pic:cNvPr id="1774233680" name=""/>
+                    <pic:cNvPicPr/>
+                  </pic:nvPicPr>
+                  <pic:blipFill>
+                    <a:blip r:embed="rId5"/>
+                    <a:stretch>
+                      <a:fillRect/>
+                    </a:stretch>
+                  </pic:blipFill>
+                  <pic:spPr>
+                    <a:xfrm>
+                      <a:off x="0" y="0"/>
+                      <a:ext cx="3792101" cy="2205073"/>
+                    </a:xfrm>
+                    <a:prstGeom prst="rect">
+                      <a:avLst/>
+                    </a:prstGeom>
+                  </pic:spPr>
+                </pic:pic>
+              </a:graphicData>
+            </a:graphic>
+          </wp:inline>
+        </w:drawing>
+      </w:r>
+      <w:r>
+        <w:br/>
+      </w:r>
+      <w:r>
+        <w:br/>
+      </w:r>
+      <w:r>
+        <w:lastRenderedPageBreak/>
+        <w:br/>
+        <w:t xml:space="preserve">Feito novas implementações e alterações nos testes automatizados na </w:t>
+      </w:r>
+      <w:r>
+        <w:rPr>
+          <w:color w:val="EE0000"/>
+        </w:rPr>
+        <w:t>CalculadoraDescontoTest:</w:t>
+      </w:r>
+      <w:r>
+        <w:br/>
+      </w:r>
+      <w:r>
+        <w:rPr>
+          <w:noProof/>
+        </w:rPr>
+        <w:drawing>
+          <wp:inline distT="0" distB="0" distL="0" distR="0" wp14:anchorId="75EAE07C" wp14:editId="4EB2EBA8">
+            <wp:extent cx="4716780" cy="2453791"/>
+            <wp:effectExtent l="0" t="0" r="7620" b="3810"/>
+            <wp:docPr id="623204403" name="Imagem 1"/>
+            <wp:cNvGraphicFramePr>
+              <a:graphicFrameLocks xmlns:a="http://schemas.openxmlformats.org/drawingml/2006/main" noChangeAspect="1"/>
+            </wp:cNvGraphicFramePr>
+            <a:graphic xmlns:a="http://schemas.openxmlformats.org/drawingml/2006/main">
+              <a:graphicData uri="http://schemas.openxmlformats.org/drawingml/2006/picture">
+                <pic:pic xmlns:pic="http://schemas.openxmlformats.org/drawingml/2006/picture">
+                  <pic:nvPicPr>
+                    <pic:cNvPr id="623204403" name=""/>
+                    <pic:cNvPicPr/>
+                  </pic:nvPicPr>
+                  <pic:blipFill>
+                    <a:blip r:embed="rId6"/>
+                    <a:stretch>
+                      <a:fillRect/>
+                    </a:stretch>
+                  </pic:blipFill>
+                  <pic:spPr>
+                    <a:xfrm>
+                      <a:off x="0" y="0"/>
+                      <a:ext cx="4733699" cy="2462593"/>
+                    </a:xfrm>
+                    <a:prstGeom prst="rect">
+                      <a:avLst/>
+                    </a:prstGeom>
+                  </pic:spPr>
+                </pic:pic>
+              </a:graphicData>
+            </a:graphic>
+          </wp:inline>
+        </w:drawing>
+      </w:r>
+      <w:r>
+        <w:br/>
+      </w:r>
+      <w:r>
+        <w:br/>
+      </w:r>
+      <w:r>
+        <w:rPr>
+          <w:noProof/>
+        </w:rPr>
+        <w:drawing>
+          <wp:inline distT="0" distB="0" distL="0" distR="0" wp14:anchorId="41077A8D" wp14:editId="56F549FD">
+            <wp:extent cx="4772736" cy="4638040"/>
+            <wp:effectExtent l="0" t="0" r="8890" b="0"/>
+            <wp:docPr id="627016705" name="Imagem 1"/>
+            <wp:cNvGraphicFramePr>
+              <a:graphicFrameLocks xmlns:a="http://schemas.openxmlformats.org/drawingml/2006/main" noChangeAspect="1"/>
+            </wp:cNvGraphicFramePr>
+            <a:graphic xmlns:a="http://schemas.openxmlformats.org/drawingml/2006/main">
+              <a:graphicData uri="http://schemas.openxmlformats.org/drawingml/2006/picture">
+                <pic:pic xmlns:pic="http://schemas.openxmlformats.org/drawingml/2006/picture">
+                  <pic:nvPicPr>
+                    <pic:cNvPr id="627016705" name=""/>
+                    <pic:cNvPicPr/>
+                  </pic:nvPicPr>
+                  <pic:blipFill>
+                    <a:blip r:embed="rId7"/>
+                    <a:stretch>
+                      <a:fillRect/>
+                    </a:stretch>
+                  </pic:blipFill>
+                  <pic:spPr>
+                    <a:xfrm>
+                      <a:off x="0" y="0"/>
+                      <a:ext cx="4777704" cy="4642868"/>
+                    </a:xfrm>
+                    <a:prstGeom prst="rect">
+                      <a:avLst/>
+                    </a:prstGeom>
+                  </pic:spPr>
+                </pic:pic>
+              </a:graphicData>
+            </a:graphic>
+          </wp:inline>
+        </w:drawing>
+      </w:r>
+    </w:p>
+    <w:p>
+      <w:r>
+        <w:rPr>
+          <w:noProof/>
+        </w:rPr>
+        <w:lastRenderedPageBreak/>
+        <w:drawing>
+          <wp:inline distT="0" distB="0" distL="0" distR="0" wp14:anchorId="1B2455CA" wp14:editId="5BFBE8EB">
+            <wp:extent cx="5400040" cy="1374140"/>
+            <wp:effectExtent l="0" t="0" r="0" b="0"/>
+            <wp:docPr id="1311989110" name="Imagem 1"/>
+            <wp:cNvGraphicFramePr>
+              <a:graphicFrameLocks xmlns:a="http://schemas.openxmlformats.org/drawingml/2006/main" noChangeAspect="1"/>
+            </wp:cNvGraphicFramePr>
+            <a:graphic xmlns:a="http://schemas.openxmlformats.org/drawingml/2006/main">
+              <a:graphicData uri="http://schemas.openxmlformats.org/drawingml/2006/picture">
+                <pic:pic xmlns:pic="http://schemas.openxmlformats.org/drawingml/2006/picture">
+                  <pic:nvPicPr>
+                    <pic:cNvPr id="1311989110" name=""/>
+                    <pic:cNvPicPr/>
+                  </pic:nvPicPr>
+                  <pic:blipFill>
+                    <a:blip r:embed="rId8"/>
+                    <a:stretch>
+                      <a:fillRect/>
+                    </a:stretch>
+                  </pic:blipFill>
+                  <pic:spPr>
+                    <a:xfrm>
+                      <a:off x="0" y="0"/>
+                      <a:ext cx="5400040" cy="1374140"/>
+                    </a:xfrm>
+                    <a:prstGeom prst="rect">
+                      <a:avLst/>
+                    </a:prstGeom>
+                  </pic:spPr>
+                </pic:pic>
+              </a:graphicData>
+            </a:graphic>
+          </wp:inline>
+        </w:drawing>
+      </w:r>
+    </w:p>
+    <w:p>
+      <w:r>
+        <w:br/>
+      </w:r>
+      <w:r>
+        <w:t>Testes unitários</w:t>
+      </w:r>
+      <w:r>
+        <w:t>, antes das implementações novas:</w:t>
+      </w:r>
+      <w:r>
+        <w:br/>
       </w:r>
       <w:r>
         <w:br/>
@@ -29,7 +373,7 @@
                     <pic:cNvPicPr/>
                   </pic:nvPicPr>
                   <pic:blipFill>
-                    <a:blip r:embed="rId4"/>
+                    <a:blip r:embed="rId9"/>
                     <a:stretch>
                       <a:fillRect/>
                     </a:stretch>
@@ -71,7 +415,7 @@
                     <pic:cNvPicPr/>
                   </pic:nvPicPr>
                   <pic:blipFill>
-                    <a:blip r:embed="rId5"/>
+                    <a:blip r:embed="rId10"/>
                     <a:stretch>
                       <a:fillRect/>
                     </a:stretch>
@@ -99,9 +443,9 @@
         </w:rPr>
         <w:lastRenderedPageBreak/>
         <w:drawing>
-          <wp:inline distT="0" distB="0" distL="0" distR="0" wp14:anchorId="0E9169C1" wp14:editId="68529766">
-            <wp:extent cx="5400040" cy="4217035"/>
-            <wp:effectExtent l="0" t="0" r="0" b="0"/>
+          <wp:inline distT="0" distB="0" distL="0" distR="0" wp14:anchorId="0E9169C1" wp14:editId="677BB625">
+            <wp:extent cx="5013960" cy="3915535"/>
+            <wp:effectExtent l="0" t="0" r="0" b="8890"/>
             <wp:docPr id="1771794775" name="Imagem 1"/>
             <wp:cNvGraphicFramePr>
               <a:graphicFrameLocks xmlns:a="http://schemas.openxmlformats.org/drawingml/2006/main" noChangeAspect="1"/>
@@ -114,7 +458,7 @@
                     <pic:cNvPicPr/>
                   </pic:nvPicPr>
                   <pic:blipFill>
-                    <a:blip r:embed="rId6"/>
+                    <a:blip r:embed="rId11"/>
                     <a:stretch>
                       <a:fillRect/>
                     </a:stretch>
@@ -122,7 +466,7 @@
                   <pic:spPr>
                     <a:xfrm>
                       <a:off x="0" y="0"/>
-                      <a:ext cx="5400040" cy="4217035"/>
+                      <a:ext cx="5018263" cy="3918895"/>
                     </a:xfrm>
                     <a:prstGeom prst="rect">
                       <a:avLst/>
@@ -134,105 +478,17 @@
           </wp:inline>
         </w:drawing>
       </w:r>
-      <w:r>
-        <w:br/>
-      </w:r>
-      <w:r>
-        <w:br/>
-      </w:r>
+    </w:p>
+    <w:p/>
+    <w:p>
       <w:r>
         <w:rPr>
           <w:noProof/>
         </w:rPr>
         <w:drawing>
-          <wp:inline distT="0" distB="0" distL="0" distR="0" wp14:anchorId="42863FEA" wp14:editId="2A7E74F1">
-            <wp:extent cx="5400040" cy="2503170"/>
-            <wp:effectExtent l="0" t="0" r="0" b="0"/>
-            <wp:docPr id="98301608" name="Imagem 1"/>
-            <wp:cNvGraphicFramePr>
-              <a:graphicFrameLocks xmlns:a="http://schemas.openxmlformats.org/drawingml/2006/main" noChangeAspect="1"/>
-            </wp:cNvGraphicFramePr>
-            <a:graphic xmlns:a="http://schemas.openxmlformats.org/drawingml/2006/main">
-              <a:graphicData uri="http://schemas.openxmlformats.org/drawingml/2006/picture">
-                <pic:pic xmlns:pic="http://schemas.openxmlformats.org/drawingml/2006/picture">
-                  <pic:nvPicPr>
-                    <pic:cNvPr id="98301608" name=""/>
-                    <pic:cNvPicPr/>
-                  </pic:nvPicPr>
-                  <pic:blipFill>
-                    <a:blip r:embed="rId7"/>
-                    <a:stretch>
-                      <a:fillRect/>
-                    </a:stretch>
-                  </pic:blipFill>
-                  <pic:spPr>
-                    <a:xfrm>
-                      <a:off x="0" y="0"/>
-                      <a:ext cx="5400040" cy="2503170"/>
-                    </a:xfrm>
-                    <a:prstGeom prst="rect">
-                      <a:avLst/>
-                    </a:prstGeom>
-                  </pic:spPr>
-                </pic:pic>
-              </a:graphicData>
-            </a:graphic>
-          </wp:inline>
-        </w:drawing>
-      </w:r>
-    </w:p>
-    <w:p>
-      <w:r>
-        <w:rPr>
-          <w:noProof/>
-        </w:rPr>
-        <w:lastRenderedPageBreak/>
-        <w:drawing>
-          <wp:inline distT="0" distB="0" distL="0" distR="0" wp14:anchorId="0099941E" wp14:editId="602798F9">
-            <wp:extent cx="5400040" cy="4170680"/>
-            <wp:effectExtent l="0" t="0" r="0" b="1270"/>
-            <wp:docPr id="216770069" name="Imagem 1"/>
-            <wp:cNvGraphicFramePr>
-              <a:graphicFrameLocks xmlns:a="http://schemas.openxmlformats.org/drawingml/2006/main" noChangeAspect="1"/>
-            </wp:cNvGraphicFramePr>
-            <a:graphic xmlns:a="http://schemas.openxmlformats.org/drawingml/2006/main">
-              <a:graphicData uri="http://schemas.openxmlformats.org/drawingml/2006/picture">
-                <pic:pic xmlns:pic="http://schemas.openxmlformats.org/drawingml/2006/picture">
-                  <pic:nvPicPr>
-                    <pic:cNvPr id="216770069" name=""/>
-                    <pic:cNvPicPr/>
-                  </pic:nvPicPr>
-                  <pic:blipFill>
-                    <a:blip r:embed="rId8"/>
-                    <a:stretch>
-                      <a:fillRect/>
-                    </a:stretch>
-                  </pic:blipFill>
-                  <pic:spPr>
-                    <a:xfrm>
-                      <a:off x="0" y="0"/>
-                      <a:ext cx="5400040" cy="4170680"/>
-                    </a:xfrm>
-                    <a:prstGeom prst="rect">
-                      <a:avLst/>
-                    </a:prstGeom>
-                  </pic:spPr>
-                </pic:pic>
-              </a:graphicData>
-            </a:graphic>
-          </wp:inline>
-        </w:drawing>
-      </w:r>
-    </w:p>
-    <w:p>
-      <w:r>
-        <w:rPr>
-          <w:noProof/>
-        </w:rPr>
-        <w:drawing>
-          <wp:inline distT="0" distB="0" distL="0" distR="0" wp14:anchorId="2EA5EE4A" wp14:editId="67AEC69D">
-            <wp:extent cx="5400040" cy="4264025"/>
-            <wp:effectExtent l="0" t="0" r="0" b="3175"/>
+          <wp:inline distT="0" distB="0" distL="0" distR="0" wp14:anchorId="2EA5EE4A" wp14:editId="77679461">
+            <wp:extent cx="4983480" cy="3935097"/>
+            <wp:effectExtent l="0" t="0" r="7620" b="8255"/>
             <wp:docPr id="1517765156" name="Imagem 1"/>
             <wp:cNvGraphicFramePr>
               <a:graphicFrameLocks xmlns:a="http://schemas.openxmlformats.org/drawingml/2006/main" noChangeAspect="1"/>
@@ -245,7 +501,7 @@
                     <pic:cNvPicPr/>
                   </pic:nvPicPr>
                   <pic:blipFill>
-                    <a:blip r:embed="rId9"/>
+                    <a:blip r:embed="rId12"/>
                     <a:stretch>
                       <a:fillRect/>
                     </a:stretch>
@@ -253,7 +509,7 @@
                   <pic:spPr>
                     <a:xfrm>
                       <a:off x="0" y="0"/>
-                      <a:ext cx="5400040" cy="4264025"/>
+                      <a:ext cx="4985591" cy="3936764"/>
                     </a:xfrm>
                     <a:prstGeom prst="rect">
                       <a:avLst/>
@@ -266,12 +522,18 @@
         </w:drawing>
       </w:r>
     </w:p>
+    <w:p/>
+    <w:p>
+      <w:r>
+        <w:lastRenderedPageBreak/>
+        <w:t>Entrada de Dados e interação antes das implementações e interface grafica.</w:t>
+      </w:r>
+    </w:p>
     <w:p>
       <w:r>
         <w:rPr>
           <w:noProof/>
         </w:rPr>
-        <w:lastRenderedPageBreak/>
         <w:drawing>
           <wp:inline distT="0" distB="0" distL="0" distR="0" wp14:anchorId="6D11F694" wp14:editId="652D6A2C">
             <wp:extent cx="3838575" cy="619125"/>
@@ -288,7 +550,7 @@
                     <pic:cNvPicPr/>
                   </pic:nvPicPr>
                   <pic:blipFill>
-                    <a:blip r:embed="rId10"/>
+                    <a:blip r:embed="rId13"/>
                     <a:stretch>
                       <a:fillRect/>
                     </a:stretch>
@@ -330,7 +592,7 @@
                     <pic:cNvPicPr/>
                   </pic:nvPicPr>
                   <pic:blipFill>
-                    <a:blip r:embed="rId11"/>
+                    <a:blip r:embed="rId14"/>
                     <a:stretch>
                       <a:fillRect/>
                     </a:stretch>
@@ -372,7 +634,7 @@
                     <pic:cNvPicPr/>
                   </pic:nvPicPr>
                   <pic:blipFill>
-                    <a:blip r:embed="rId12"/>
+                    <a:blip r:embed="rId15"/>
                     <a:stretch>
                       <a:fillRect/>
                     </a:stretch>
@@ -414,7 +676,7 @@
                     <pic:cNvPicPr/>
                   </pic:nvPicPr>
                   <pic:blipFill>
-                    <a:blip r:embed="rId13"/>
+                    <a:blip r:embed="rId16"/>
                     <a:stretch>
                       <a:fillRect/>
                     </a:stretch>
@@ -456,7 +718,7 @@
                     <pic:cNvPicPr/>
                   </pic:nvPicPr>
                   <pic:blipFill>
-                    <a:blip r:embed="rId14"/>
+                    <a:blip r:embed="rId17"/>
                     <a:stretch>
                       <a:fillRect/>
                     </a:stretch>

</xml_diff>